<commit_message>
Update Company Profile: isi data NIB, alamat, kontak, status hukum
</commit_message>
<xml_diff>
--- a/Company_Profile_PPBIB.docx
+++ b/Company_Profile_PPBIB.docx
@@ -798,7 +798,7 @@
                 <w:b/>
                 <w:sz w:val="20"/>
               </w:rPr>
-              <w:t>Nomor NIB</w:t>
+              <w:t>Status Hukum</w:t>
             </w:r>
           </w:p>
         </w:tc>
@@ -812,7 +812,7 @@
               <w:rPr>
                 <w:sz w:val="20"/>
               </w:rPr>
-              <w:t>[Diisi sesuai data lembaga]</w:t>
+              <w:t>Belum berbadan hukum (dalam proses)</w:t>
             </w:r>
           </w:p>
         </w:tc>
@@ -829,7 +829,7 @@
                 <w:b/>
                 <w:sz w:val="20"/>
               </w:rPr>
-              <w:t>NPWP</w:t>
+              <w:t>Nomor NIB</w:t>
             </w:r>
           </w:p>
         </w:tc>
@@ -843,7 +843,7 @@
               <w:rPr>
                 <w:sz w:val="20"/>
               </w:rPr>
-              <w:t>[Diisi sesuai data lembaga]</w:t>
+              <w:t>2505260006769</w:t>
             </w:r>
           </w:p>
         </w:tc>
@@ -860,7 +860,7 @@
                 <w:b/>
                 <w:sz w:val="20"/>
               </w:rPr>
-              <w:t>Akta Pendirian</w:t>
+              <w:t>Alamat</w:t>
             </w:r>
           </w:p>
         </w:tc>
@@ -874,7 +874,7 @@
               <w:rPr>
                 <w:sz w:val="20"/>
               </w:rPr>
-              <w:t>[Nomor Akta / Tanggal]</w:t>
+              <w:t>Jl. KH Halimi, Warung Menteng, Cijeruk, Bogor</w:t>
             </w:r>
           </w:p>
         </w:tc>
@@ -891,7 +891,7 @@
                 <w:b/>
                 <w:sz w:val="20"/>
               </w:rPr>
-              <w:t>Alamat</w:t>
+              <w:t>Telepon / WA</w:t>
             </w:r>
           </w:p>
         </w:tc>
@@ -905,7 +905,7 @@
               <w:rPr>
                 <w:sz w:val="20"/>
               </w:rPr>
-              <w:t>[Alamat Lengkap Lembaga]</w:t>
+              <w:t>085180579665</w:t>
             </w:r>
           </w:p>
         </w:tc>
@@ -922,7 +922,7 @@
                 <w:b/>
                 <w:sz w:val="20"/>
               </w:rPr>
-              <w:t>Telepon / WA</w:t>
+              <w:t>Email</w:t>
             </w:r>
           </w:p>
         </w:tc>
@@ -936,7 +936,7 @@
               <w:rPr>
                 <w:sz w:val="20"/>
               </w:rPr>
-              <w:t>[Nomor Telepon / WhatsApp]</w:t>
+              <w:t>ppbib2025@gmail.com</w:t>
             </w:r>
           </w:p>
         </w:tc>
@@ -953,7 +953,7 @@
                 <w:b/>
                 <w:sz w:val="20"/>
               </w:rPr>
-              <w:t>Email</w:t>
+              <w:t>TikTok</w:t>
             </w:r>
           </w:p>
         </w:tc>
@@ -967,7 +967,7 @@
               <w:rPr>
                 <w:sz w:val="20"/>
               </w:rPr>
-              <w:t>[Email Resmi]</w:t>
+              <w:t>@ppbibbogor</w:t>
             </w:r>
           </w:p>
         </w:tc>
@@ -984,7 +984,7 @@
                 <w:b/>
                 <w:sz w:val="20"/>
               </w:rPr>
-              <w:t>Website / Sosmed</w:t>
+              <w:t>Instagram</w:t>
             </w:r>
           </w:p>
         </w:tc>
@@ -998,7 +998,7 @@
               <w:rPr>
                 <w:sz w:val="20"/>
               </w:rPr>
-              <w:t>[Website / Instagram / TikTok]</w:t>
+              <w:t>@pelatihanikanbogor</w:t>
             </w:r>
           </w:p>
         </w:tc>
@@ -1124,7 +1124,9 @@
         </w:rPr>
         <w:t>Untuk informasi lebih lanjut, hubungi kami:</w:t>
         <w:br/>
-        <w:t>[Nama PIC]  |  [No. HP/WA]  |  [Email]</w:t>
+        <w:t>085180579665  |  ppbib2025@gmail.com</w:t>
+        <w:br/>
+        <w:t>@ppbibbogor (TikTok)  |  @pelatihanikanbogor (Instagram)</w:t>
       </w:r>
     </w:p>
     <w:sectPr>

</xml_diff>

<commit_message>
Add logo placeholder to Company Profile
</commit_message>
<xml_diff>
--- a/Company_Profile_PPBIB.docx
+++ b/Company_Profile_PPBIB.docx
@@ -2,6 +2,50 @@
 <file path=word/document.xml><?xml version="1.0" encoding="utf-8"?>
 <w:document xmlns:wpc="http://schemas.microsoft.com/office/word/2010/wordprocessingCanvas" xmlns:mo="http://schemas.microsoft.com/office/mac/office/2008/main" xmlns:mc="http://schemas.openxmlformats.org/markup-compatibility/2006" xmlns:mv="urn:schemas-microsoft-com:mac:vml" xmlns:o="urn:schemas-microsoft-com:office:office" xmlns:r="http://schemas.openxmlformats.org/officeDocument/2006/relationships" xmlns:m="http://schemas.openxmlformats.org/officeDocument/2006/math" xmlns:v="urn:schemas-microsoft-com:vml" xmlns:wp14="http://schemas.microsoft.com/office/word/2010/wordprocessingDrawing" xmlns:wp="http://schemas.openxmlformats.org/drawingml/2006/wordprocessingDrawing" xmlns:w10="urn:schemas-microsoft-com:office:word" xmlns:w="http://schemas.openxmlformats.org/wordprocessingml/2006/main" xmlns:w14="http://schemas.microsoft.com/office/word/2010/wordml" xmlns:wpg="http://schemas.microsoft.com/office/word/2010/wordprocessingGroup" xmlns:wpi="http://schemas.microsoft.com/office/word/2010/wordprocessingInk" xmlns:wne="http://schemas.microsoft.com/office/word/2006/wordml" xmlns:wps="http://schemas.microsoft.com/office/word/2010/wordprocessingShape" mc:Ignorable="w14 wp14">
   <w:body>
+    <w:tbl>
+      <w:tblPr>
+        <w:tblStyle w:val="TableGrid"/>
+        <w:tblW w:type="auto" w:w="0"/>
+        <w:tblLook w:firstColumn="1" w:firstRow="1" w:lastColumn="0" w:lastRow="0" w:noHBand="0" w:noVBand="1" w:val="04A0"/>
+      </w:tblPr>
+      <w:tblGrid>
+        <w:gridCol w:w="9122"/>
+      </w:tblGrid>
+      <w:tr>
+        <w:tc>
+          <w:tcPr>
+            <w:tcW w:type="dxa" w:w="2268"/>
+            <w:shd w:val="clear" w:color="auto" w:fill="F5F5F5"/>
+          </w:tcPr>
+          <w:p>
+            <w:pPr>
+              <w:spacing w:before="360" w:after="360"/>
+              <w:jc w:val="center"/>
+            </w:pPr>
+            <w:r>
+              <w:rPr>
+                <w:b/>
+                <w:color w:val="999999"/>
+                <w:sz w:val="24"/>
+              </w:rPr>
+              <w:t>[ LOGO PPBIB ]</w:t>
+            </w:r>
+            <w:r>
+              <w:br/>
+            </w:r>
+            <w:r>
+              <w:rPr>
+                <w:i/>
+                <w:color w:val="BBBBBB"/>
+                <w:sz w:val="16"/>
+              </w:rPr>
+              <w:t>Ganti dengan logo: Insert → Picture</w:t>
+            </w:r>
+          </w:p>
+        </w:tc>
+      </w:tr>
+    </w:tbl>
+    <w:p/>
     <w:p>
       <w:pPr>
         <w:spacing w:before="0" w:after="80"/>

</xml_diff>